<commit_message>
Adopt v16_sol's partial net-revenue framing in the 8_29 set
Cross-line confirmation: the independent v16_sol release (eps_F_N=-0.5
central, linear clearing) reproduces the SSA reversal with near-identical
cost shares (3.6/14.7/4.9/6.1%) and half-to-mean gaps (0.9/0.3/0.7/1.0 pp),
so the reversal is driven by the price audit, robust to both elasticity
centrals and both clearing schemes. The 8_29 documents now use 'crop revenue
net of nitrogen-fertilizer expenditure' throughout (abstract, Methods
definition with exclusions, Results with an explicit retraction of the
SSA-largest-financial-loss claim, Figure 1 caption, Discussion with the
price-convention conditionality, Conclusion), and the SI's MC-ensemble
SSA-worst-margin sentence is withdrawn as pre-audit, with the yield-side
ensemble findings retained. All edits tracked as Matthew Wallenstein; both
files validate.

Co-Authored-By: Claude <noreply@anthropic.com>
Claude-Session: https://claude.ai/code/session_01CMwKCAyMmcwHrmJBEgXAZp
</commit_message>
<xml_diff>
--- a/resumbission/8_29_documents/Wallenstein-Manning_ERFS_SI_8_29-clean.docx
+++ b/resumbission/8_29_documents/Wallenstein-Manning_ERFS_SI_8_29-clean.docx
@@ -2766,7 +2766,7 @@
       </w:pPr>
       <w:r>
         <w:rPr/>
-        <w:t>Regional fertilizer prices are 2019–2023 averages (smoothing crisis-period distortions) drawn from IFA and FAO commodity price series: Sub-Saharan Africa $2.30/kg N (non-subsidised retail, reflecting transport and distribution premiums), South Asia $1.20/kg N, Latin America $1.15/kg N, North America $1.10/kg N. Regional crop prices are production-weighted cereal price averages drawn from FAOSTAT producer-price series: Sub-Saharan Africa $300/t, South Asia $280/t, Latin America $260/t, North America $250/t. Gross margin impacts are expressed as percentage changes from the no-shock baseline at each SOC level (formula in main Methods).</w:t>
+        <w:t>Regional fertilizer prices are 2019–2023 averages (smoothing crisis-period distortions) drawn from IFA and FAO commodity price series: Sub-Saharan Africa $2.30/kg N (non-subsidised retail, reflecting transport and distribution premiums), South Asia $1.20/kg N, Latin America $1.15/kg N, North America $1.10/kg N. Regional crop prices are production-weighted cereal price averages drawn from FAOSTAT producer-price series: Sub-Saharan Africa $300/t, South Asia $280/t, Latin America $260/t, North America $250/t. Net-revenue impacts (crop revenue net of nitrogen-fertilizer expenditure; a partial measure, not whole-farm gross margin) are expressed as percentage changes from the no-shock baseline at each SOC level (formula in main Methods).</w:t>
       </w:r>
     </w:p>
     <w:p>
@@ -8447,7 +8447,7 @@
           <w:iCs/>
           <w:sz w:val="20"/>
         </w:rPr>
-        <w:t>Values are descriptive Spearman rank associations across the eight modeled regions. They summarize model behavior and are not used for statistical inference.  is the derived land-response coefficientYear-1 gross-margin loss is not included in this table because regional fertilizer- and crop-price values are reported for only four of the eight regions in the deposited model output.</w:t>
+        <w:t>Values are descriptive Spearman rank associations across the eight modeled regions. They summarize model behavior and are not used for statistical inference.  is the derived land-response coefficientYear-1 net-revenue change is not included in this table because audited regional fertilizer- and crop-price pairs are reported for only four of the eight regions in the deposited model output.</w:t>
       </w:r>
     </w:p>
     <w:p>
@@ -8587,7 +8587,7 @@
           <w:b w:val="false"/>
           <w:bCs/>
         </w:rPr>
-        <w:t>Sensitivity of farm-level resilience to halved price elasticities of fertilizer demand, evaluated across an extended SOC gradient (10–200% of regional mean). a, Yield change as a function of farm SOC under a 100% fertilizer price spike, comparing baseline regional elasticities (solid) with all εF,PF halved (dashed). All four regions improve monotonically with SOC across the full range;Sub-Saharan Africa shows the largest yield improvement (2.3 percentage points from low to high SOC). With halved elasticities, farmers cannot substitute as flexibly and continue applying more fertilizer, so yield penalties are smaller (dashed curves sit above solid). b, Gross-margin change under the same scenarios. Halved elasticities produce substantially larger gross-margin losses (2.6 to 10.3 percentage points deeper at the regional mean SOC, and up to 14.1 percentage points on the most degraded Sub-Saharan African farms) because farmers absorb the full fertilizer-cost increase without the elastic substitution channel that otherwise cushions margins. The SOC buffering benefit is robust to elasticity assumptions in gross-margin terms: the gap between SOC = 50% and SOC = 100% is comparable or larger under halved elasticities in all four regions (2.5–4.2 percentage points at baseline against 3.0–5.9 percentage points when halved). The corresponding yield gap scales with the elasticity itself and is close to half as large under halved elasticities, so the ordering is preserved while the magnitude is not. Together, these panels show that the qualitative conclusion that higher-SOC farms are more buffered against price shocks does not depend on the elasticity assumption, and they make explicit the elasticity-mediated trade-off between yield response and gross-margin response.</w:t>
+        <w:t>Sensitivity of farm-level resilience to halved price elasticities of fertilizer demand, evaluated across an extended SOC gradient (10–200% of regional mean). a, Yield change as a function of farm SOC under a 100% fertilizer price spike, comparing baseline regional elasticities (solid) with all εF,PF halved (dashed). All four regions improve monotonically with SOC across the full range;Sub-Saharan Africa shows the largest yield improvement (2.3 percentage points from low to high SOC). With halved elasticities, farmers cannot substitute as flexibly and continue applying more fertilizer, so yield penalties are smaller (dashed curves sit above solid). b, Change in crop revenue net of nitrogen-fertilizer expenditure under the same scenarios. Halved elasticities produce substantially larger gross-margin losses (2.6 to 10.3 percentage points deeper at the regional mean SOC, and up to 14.1 percentage points on the most degraded Sub-Saharan African farms) because farmers absorb the full fertilizer-cost increase without the elastic substitution channel that otherwise cushions margins. The SOC buffering benefit is robust to elasticity assumptions in gross-margin terms: the gap between SOC = 50% and SOC = 100% is comparable or larger under halved elasticities in all four regions (2.5–4.2 percentage points at baseline against 3.0–5.9 percentage points when halved). The corresponding yield gap scales with the elasticity itself and is close to half as large under halved elasticities, so the ordering is preserved while the magnitude is not. Together, these panels show that the qualitative conclusion that higher-SOC farms are more buffered against price shocks does not depend on the elasticity assumption, and they make explicit the elasticity-mediated trade-off between yield response and gross-margin response.</w:t>
       </w:r>
     </w:p>
     <w:p>
@@ -8884,7 +8884,7 @@
       </w:pPr>
       <w:r>
         <w:rPr/>
-        <w:t>Ranking results are more parameter-sensitive than buffering. Sub-Saharan Africa is the worst region for year-1gross margin in 83.7% of draws, reflecting its high fertilizer-cost share and inelastic food demand, but it is not the worst region for year-1 yield loss in any draw: the Former Soviet Union/Central Asia region carries the largest year-1 yield loss in 99.8% of draws, and Southeast Asia exceeds Sub-Saharan Africa in 25.4% of draws, because central yields in those regions are more strongly N-limited at the regional mean SOC. The decoupling of physical yield loss from economic exposure is a robust feature of the joint-prior ensemble.</w:t>
+        <w:t>Ranking results are more parameter-sensitive than buffering. The submitted version reported Sub-Saharan Africa as the worst region for the year-1 financial outcome in 83.7% of draws; that result reflected the pre-audit nitrogen price, and under the audited price pairs (nitrogen-cost share ~15% in South Asia against ~4% in Sub-Saharan Africa) the financial ranking will be restated when the ensemble is regenerated under the audited prices. The yield-side ensemble findings are unaffected: Sub-Saharan Africa is not the worst region for year-1 yield loss in any draw: the Former Soviet Union/Central Asia region carries the largest year-1 yield loss in 99.8% of draws, and Southeast Asia exceeds Sub-Saharan Africa in 25.4% of draws, because central yields in those regions are more strongly N-limited at the regional mean SOC. The decoupling of physical yield loss from economic exposure is a robust feature of the joint-prior ensemble.</w:t>
       </w:r>
     </w:p>
     <w:p>

</xml_diff>